<commit_message>
update report and model outputs
</commit_message>
<xml_diff>
--- a/house_price_report.docx
+++ b/house_price_report.docx
@@ -391,12 +391,6 @@
         <w:gridCol w:w="2026"/>
       </w:tblGrid>
       <w:tr>
-        <w:tblPrEx>
-          <w:tblCellMar>
-            <w:top w:w="0" w:type="dxa"/>
-            <w:bottom w:w="0" w:type="dxa"/>
-          </w:tblCellMar>
-        </w:tblPrEx>
         <w:trPr>
           <w:tblHeader/>
         </w:trPr>
@@ -495,12 +489,6 @@
         </w:tc>
       </w:tr>
       <w:tr>
-        <w:tblPrEx>
-          <w:tblCellMar>
-            <w:top w:w="0" w:type="dxa"/>
-            <w:bottom w:w="0" w:type="dxa"/>
-          </w:tblCellMar>
-        </w:tblPrEx>
         <w:tc>
           <w:tcPr>
             <w:tcW w:w="3100" w:type="dxa"/>
@@ -587,12 +575,6 @@
         </w:tc>
       </w:tr>
       <w:tr>
-        <w:tblPrEx>
-          <w:tblCellMar>
-            <w:top w:w="0" w:type="dxa"/>
-            <w:bottom w:w="0" w:type="dxa"/>
-          </w:tblCellMar>
-        </w:tblPrEx>
         <w:tc>
           <w:tcPr>
             <w:tcW w:w="3100" w:type="dxa"/>
@@ -679,12 +661,6 @@
         </w:tc>
       </w:tr>
       <w:tr>
-        <w:tblPrEx>
-          <w:tblCellMar>
-            <w:top w:w="0" w:type="dxa"/>
-            <w:bottom w:w="0" w:type="dxa"/>
-          </w:tblCellMar>
-        </w:tblPrEx>
         <w:tc>
           <w:tcPr>
             <w:tcW w:w="3100" w:type="dxa"/>
@@ -771,12 +747,6 @@
         </w:tc>
       </w:tr>
       <w:tr>
-        <w:tblPrEx>
-          <w:tblCellMar>
-            <w:top w:w="0" w:type="dxa"/>
-            <w:bottom w:w="0" w:type="dxa"/>
-          </w:tblCellMar>
-        </w:tblPrEx>
         <w:tc>
           <w:tcPr>
             <w:tcW w:w="3100" w:type="dxa"/>
@@ -863,12 +833,6 @@
         </w:tc>
       </w:tr>
       <w:tr>
-        <w:tblPrEx>
-          <w:tblCellMar>
-            <w:top w:w="0" w:type="dxa"/>
-            <w:bottom w:w="0" w:type="dxa"/>
-          </w:tblCellMar>
-        </w:tblPrEx>
         <w:tc>
           <w:tcPr>
             <w:tcW w:w="3100" w:type="dxa"/>
@@ -1771,12 +1735,6 @@
         <w:gridCol w:w="3726"/>
       </w:tblGrid>
       <w:tr>
-        <w:tblPrEx>
-          <w:tblCellMar>
-            <w:top w:w="0" w:type="dxa"/>
-            <w:bottom w:w="0" w:type="dxa"/>
-          </w:tblCellMar>
-        </w:tblPrEx>
         <w:trPr>
           <w:tblHeader/>
         </w:trPr>
@@ -1875,12 +1833,6 @@
         </w:tc>
       </w:tr>
       <w:tr>
-        <w:tblPrEx>
-          <w:tblCellMar>
-            <w:top w:w="0" w:type="dxa"/>
-            <w:bottom w:w="0" w:type="dxa"/>
-          </w:tblCellMar>
-        </w:tblPrEx>
         <w:tc>
           <w:tcPr>
             <w:tcW w:w="1800" w:type="dxa"/>
@@ -2041,12 +1993,6 @@
         </w:tc>
       </w:tr>
       <w:tr>
-        <w:tblPrEx>
-          <w:tblCellMar>
-            <w:top w:w="0" w:type="dxa"/>
-            <w:bottom w:w="0" w:type="dxa"/>
-          </w:tblCellMar>
-        </w:tblPrEx>
         <w:tc>
           <w:tcPr>
             <w:tcW w:w="1800" w:type="dxa"/>
@@ -2171,12 +2117,6 @@
         </w:tc>
       </w:tr>
       <w:tr>
-        <w:tblPrEx>
-          <w:tblCellMar>
-            <w:top w:w="0" w:type="dxa"/>
-            <w:bottom w:w="0" w:type="dxa"/>
-          </w:tblCellMar>
-        </w:tblPrEx>
         <w:tc>
           <w:tcPr>
             <w:tcW w:w="1800" w:type="dxa"/>
@@ -2273,12 +2213,6 @@
         </w:tc>
       </w:tr>
       <w:tr>
-        <w:tblPrEx>
-          <w:tblCellMar>
-            <w:top w:w="0" w:type="dxa"/>
-            <w:bottom w:w="0" w:type="dxa"/>
-          </w:tblCellMar>
-        </w:tblPrEx>
         <w:tc>
           <w:tcPr>
             <w:tcW w:w="1800" w:type="dxa"/>
@@ -2385,12 +2319,6 @@
         </w:tc>
       </w:tr>
       <w:tr>
-        <w:tblPrEx>
-          <w:tblCellMar>
-            <w:top w:w="0" w:type="dxa"/>
-            <w:bottom w:w="0" w:type="dxa"/>
-          </w:tblCellMar>
-        </w:tblPrEx>
         <w:tc>
           <w:tcPr>
             <w:tcW w:w="1800" w:type="dxa"/>
@@ -2487,12 +2415,6 @@
         </w:tc>
       </w:tr>
       <w:tr>
-        <w:tblPrEx>
-          <w:tblCellMar>
-            <w:top w:w="0" w:type="dxa"/>
-            <w:bottom w:w="0" w:type="dxa"/>
-          </w:tblCellMar>
-        </w:tblPrEx>
         <w:tc>
           <w:tcPr>
             <w:tcW w:w="1800" w:type="dxa"/>
@@ -2579,12 +2501,6 @@
         </w:tc>
       </w:tr>
       <w:tr>
-        <w:tblPrEx>
-          <w:tblCellMar>
-            <w:top w:w="0" w:type="dxa"/>
-            <w:bottom w:w="0" w:type="dxa"/>
-          </w:tblCellMar>
-        </w:tblPrEx>
         <w:tc>
           <w:tcPr>
             <w:tcW w:w="1800" w:type="dxa"/>
@@ -2691,12 +2607,6 @@
         </w:tc>
       </w:tr>
       <w:tr>
-        <w:tblPrEx>
-          <w:tblCellMar>
-            <w:top w:w="0" w:type="dxa"/>
-            <w:bottom w:w="0" w:type="dxa"/>
-          </w:tblCellMar>
-        </w:tblPrEx>
         <w:tc>
           <w:tcPr>
             <w:tcW w:w="1800" w:type="dxa"/>
@@ -2785,12 +2695,6 @@
         </w:tc>
       </w:tr>
       <w:tr>
-        <w:tblPrEx>
-          <w:tblCellMar>
-            <w:top w:w="0" w:type="dxa"/>
-            <w:bottom w:w="0" w:type="dxa"/>
-          </w:tblCellMar>
-        </w:tblPrEx>
         <w:tc>
           <w:tcPr>
             <w:tcW w:w="1800" w:type="dxa"/>
@@ -2897,12 +2801,6 @@
         </w:tc>
       </w:tr>
       <w:tr>
-        <w:tblPrEx>
-          <w:tblCellMar>
-            <w:top w:w="0" w:type="dxa"/>
-            <w:bottom w:w="0" w:type="dxa"/>
-          </w:tblCellMar>
-        </w:tblPrEx>
         <w:tc>
           <w:tcPr>
             <w:tcW w:w="1800" w:type="dxa"/>
@@ -3332,12 +3230,6 @@
         <w:gridCol w:w="1102"/>
       </w:tblGrid>
       <w:tr>
-        <w:tblPrEx>
-          <w:tblCellMar>
-            <w:top w:w="0" w:type="dxa"/>
-            <w:bottom w:w="0" w:type="dxa"/>
-          </w:tblCellMar>
-        </w:tblPrEx>
         <w:trPr>
           <w:tblHeader/>
         </w:trPr>
@@ -3529,12 +3421,6 @@
         </w:tc>
       </w:tr>
       <w:tr>
-        <w:tblPrEx>
-          <w:tblCellMar>
-            <w:top w:w="0" w:type="dxa"/>
-            <w:bottom w:w="0" w:type="dxa"/>
-          </w:tblCellMar>
-        </w:tblPrEx>
         <w:tc>
           <w:tcPr>
             <w:tcW w:w="2879" w:type="dxa"/>
@@ -3709,12 +3595,6 @@
         </w:tc>
       </w:tr>
       <w:tr>
-        <w:tblPrEx>
-          <w:tblCellMar>
-            <w:top w:w="0" w:type="dxa"/>
-            <w:bottom w:w="0" w:type="dxa"/>
-          </w:tblCellMar>
-        </w:tblPrEx>
         <w:tc>
           <w:tcPr>
             <w:tcW w:w="2879" w:type="dxa"/>
@@ -3885,12 +3765,6 @@
         </w:tc>
       </w:tr>
       <w:tr>
-        <w:tblPrEx>
-          <w:tblCellMar>
-            <w:top w:w="0" w:type="dxa"/>
-            <w:bottom w:w="0" w:type="dxa"/>
-          </w:tblCellMar>
-        </w:tblPrEx>
         <w:tc>
           <w:tcPr>
             <w:tcW w:w="2879" w:type="dxa"/>
@@ -4061,12 +3935,6 @@
         </w:tc>
       </w:tr>
       <w:tr>
-        <w:tblPrEx>
-          <w:tblCellMar>
-            <w:top w:w="0" w:type="dxa"/>
-            <w:bottom w:w="0" w:type="dxa"/>
-          </w:tblCellMar>
-        </w:tblPrEx>
         <w:tc>
           <w:tcPr>
             <w:tcW w:w="2879" w:type="dxa"/>
@@ -4237,12 +4105,6 @@
         </w:tc>
       </w:tr>
       <w:tr>
-        <w:tblPrEx>
-          <w:tblCellMar>
-            <w:top w:w="0" w:type="dxa"/>
-            <w:bottom w:w="0" w:type="dxa"/>
-          </w:tblCellMar>
-        </w:tblPrEx>
         <w:tc>
           <w:tcPr>
             <w:tcW w:w="2879" w:type="dxa"/>
@@ -4417,12 +4279,6 @@
         </w:tc>
       </w:tr>
       <w:tr>
-        <w:tblPrEx>
-          <w:tblCellMar>
-            <w:top w:w="0" w:type="dxa"/>
-            <w:bottom w:w="0" w:type="dxa"/>
-          </w:tblCellMar>
-        </w:tblPrEx>
         <w:tc>
           <w:tcPr>
             <w:tcW w:w="2879" w:type="dxa"/>
@@ -4593,12 +4449,6 @@
         </w:tc>
       </w:tr>
       <w:tr>
-        <w:tblPrEx>
-          <w:tblCellMar>
-            <w:top w:w="0" w:type="dxa"/>
-            <w:bottom w:w="0" w:type="dxa"/>
-          </w:tblCellMar>
-        </w:tblPrEx>
         <w:tc>
           <w:tcPr>
             <w:tcW w:w="2879" w:type="dxa"/>
@@ -4934,12 +4784,6 @@
         <w:gridCol w:w="4726"/>
       </w:tblGrid>
       <w:tr>
-        <w:tblPrEx>
-          <w:tblCellMar>
-            <w:top w:w="0" w:type="dxa"/>
-            <w:bottom w:w="0" w:type="dxa"/>
-          </w:tblCellMar>
-        </w:tblPrEx>
         <w:trPr>
           <w:tblHeader/>
         </w:trPr>
@@ -5069,12 +4913,6 @@
         </w:tc>
       </w:tr>
       <w:tr>
-        <w:tblPrEx>
-          <w:tblCellMar>
-            <w:top w:w="0" w:type="dxa"/>
-            <w:bottom w:w="0" w:type="dxa"/>
-          </w:tblCellMar>
-        </w:tblPrEx>
         <w:tc>
           <w:tcPr>
             <w:tcW w:w="2000" w:type="dxa"/>
@@ -5189,12 +5027,6 @@
         </w:tc>
       </w:tr>
       <w:tr>
-        <w:tblPrEx>
-          <w:tblCellMar>
-            <w:top w:w="0" w:type="dxa"/>
-            <w:bottom w:w="0" w:type="dxa"/>
-          </w:tblCellMar>
-        </w:tblPrEx>
         <w:tc>
           <w:tcPr>
             <w:tcW w:w="2000" w:type="dxa"/>
@@ -5309,12 +5141,6 @@
         </w:tc>
       </w:tr>
       <w:tr>
-        <w:tblPrEx>
-          <w:tblCellMar>
-            <w:top w:w="0" w:type="dxa"/>
-            <w:bottom w:w="0" w:type="dxa"/>
-          </w:tblCellMar>
-        </w:tblPrEx>
         <w:tc>
           <w:tcPr>
             <w:tcW w:w="2000" w:type="dxa"/>
@@ -5429,12 +5255,6 @@
         </w:tc>
       </w:tr>
       <w:tr>
-        <w:tblPrEx>
-          <w:tblCellMar>
-            <w:top w:w="0" w:type="dxa"/>
-            <w:bottom w:w="0" w:type="dxa"/>
-          </w:tblCellMar>
-        </w:tblPrEx>
         <w:tc>
           <w:tcPr>
             <w:tcW w:w="2000" w:type="dxa"/>
@@ -5549,12 +5369,6 @@
         </w:tc>
       </w:tr>
       <w:tr>
-        <w:tblPrEx>
-          <w:tblCellMar>
-            <w:top w:w="0" w:type="dxa"/>
-            <w:bottom w:w="0" w:type="dxa"/>
-          </w:tblCellMar>
-        </w:tblPrEx>
         <w:tc>
           <w:tcPr>
             <w:tcW w:w="2000" w:type="dxa"/>
@@ -5669,12 +5483,6 @@
         </w:tc>
       </w:tr>
       <w:tr>
-        <w:tblPrEx>
-          <w:tblCellMar>
-            <w:top w:w="0" w:type="dxa"/>
-            <w:bottom w:w="0" w:type="dxa"/>
-          </w:tblCellMar>
-        </w:tblPrEx>
         <w:tc>
           <w:tcPr>
             <w:tcW w:w="2000" w:type="dxa"/>
@@ -5789,12 +5597,6 @@
         </w:tc>
       </w:tr>
       <w:tr>
-        <w:tblPrEx>
-          <w:tblCellMar>
-            <w:top w:w="0" w:type="dxa"/>
-            <w:bottom w:w="0" w:type="dxa"/>
-          </w:tblCellMar>
-        </w:tblPrEx>
         <w:tc>
           <w:tcPr>
             <w:tcW w:w="2000" w:type="dxa"/>
@@ -6238,12 +6040,6 @@
         <w:gridCol w:w="6426"/>
       </w:tblGrid>
       <w:tr>
-        <w:tblPrEx>
-          <w:tblCellMar>
-            <w:top w:w="0" w:type="dxa"/>
-            <w:bottom w:w="0" w:type="dxa"/>
-          </w:tblCellMar>
-        </w:tblPrEx>
         <w:trPr>
           <w:tblHeader/>
         </w:trPr>
@@ -6342,12 +6138,6 @@
         </w:tc>
       </w:tr>
       <w:tr>
-        <w:tblPrEx>
-          <w:tblCellMar>
-            <w:top w:w="0" w:type="dxa"/>
-            <w:bottom w:w="0" w:type="dxa"/>
-          </w:tblCellMar>
-        </w:tblPrEx>
         <w:tc>
           <w:tcPr>
             <w:tcW w:w="2000" w:type="dxa"/>
@@ -6464,12 +6254,6 @@
         </w:tc>
       </w:tr>
       <w:tr>
-        <w:tblPrEx>
-          <w:tblCellMar>
-            <w:top w:w="0" w:type="dxa"/>
-            <w:bottom w:w="0" w:type="dxa"/>
-          </w:tblCellMar>
-        </w:tblPrEx>
         <w:tc>
           <w:tcPr>
             <w:tcW w:w="2000" w:type="dxa"/>
@@ -6576,12 +6360,6 @@
         </w:tc>
       </w:tr>
       <w:tr>
-        <w:tblPrEx>
-          <w:tblCellMar>
-            <w:top w:w="0" w:type="dxa"/>
-            <w:bottom w:w="0" w:type="dxa"/>
-          </w:tblCellMar>
-        </w:tblPrEx>
         <w:tc>
           <w:tcPr>
             <w:tcW w:w="2000" w:type="dxa"/>
@@ -6688,12 +6466,6 @@
         </w:tc>
       </w:tr>
       <w:tr>
-        <w:tblPrEx>
-          <w:tblCellMar>
-            <w:top w:w="0" w:type="dxa"/>
-            <w:bottom w:w="0" w:type="dxa"/>
-          </w:tblCellMar>
-        </w:tblPrEx>
         <w:tc>
           <w:tcPr>
             <w:tcW w:w="2000" w:type="dxa"/>
@@ -6782,12 +6554,6 @@
         </w:tc>
       </w:tr>
       <w:tr>
-        <w:tblPrEx>
-          <w:tblCellMar>
-            <w:top w:w="0" w:type="dxa"/>
-            <w:bottom w:w="0" w:type="dxa"/>
-          </w:tblCellMar>
-        </w:tblPrEx>
         <w:tc>
           <w:tcPr>
             <w:tcW w:w="2000" w:type="dxa"/>
@@ -6894,12 +6660,6 @@
         </w:tc>
       </w:tr>
       <w:tr>
-        <w:tblPrEx>
-          <w:tblCellMar>
-            <w:top w:w="0" w:type="dxa"/>
-            <w:bottom w:w="0" w:type="dxa"/>
-          </w:tblCellMar>
-        </w:tblPrEx>
         <w:tc>
           <w:tcPr>
             <w:tcW w:w="2000" w:type="dxa"/>
@@ -6988,12 +6748,6 @@
         </w:tc>
       </w:tr>
       <w:tr>
-        <w:tblPrEx>
-          <w:tblCellMar>
-            <w:top w:w="0" w:type="dxa"/>
-            <w:bottom w:w="0" w:type="dxa"/>
-          </w:tblCellMar>
-        </w:tblPrEx>
         <w:tc>
           <w:tcPr>
             <w:tcW w:w="2000" w:type="dxa"/>
@@ -7080,12 +6834,6 @@
         </w:tc>
       </w:tr>
       <w:tr>
-        <w:tblPrEx>
-          <w:tblCellMar>
-            <w:top w:w="0" w:type="dxa"/>
-            <w:bottom w:w="0" w:type="dxa"/>
-          </w:tblCellMar>
-        </w:tblPrEx>
         <w:tc>
           <w:tcPr>
             <w:tcW w:w="2000" w:type="dxa"/>
@@ -7190,12 +6938,6 @@
         </w:tc>
       </w:tr>
       <w:tr>
-        <w:tblPrEx>
-          <w:tblCellMar>
-            <w:top w:w="0" w:type="dxa"/>
-            <w:bottom w:w="0" w:type="dxa"/>
-          </w:tblCellMar>
-        </w:tblPrEx>
         <w:tc>
           <w:tcPr>
             <w:tcW w:w="2000" w:type="dxa"/>
@@ -7284,12 +7026,6 @@
         </w:tc>
       </w:tr>
       <w:tr>
-        <w:tblPrEx>
-          <w:tblCellMar>
-            <w:top w:w="0" w:type="dxa"/>
-            <w:bottom w:w="0" w:type="dxa"/>
-          </w:tblCellMar>
-        </w:tblPrEx>
         <w:tc>
           <w:tcPr>
             <w:tcW w:w="2000" w:type="dxa"/>
@@ -7724,12 +7460,6 @@
         <w:gridCol w:w="2226"/>
       </w:tblGrid>
       <w:tr>
-        <w:tblPrEx>
-          <w:tblCellMar>
-            <w:top w:w="0" w:type="dxa"/>
-            <w:bottom w:w="0" w:type="dxa"/>
-          </w:tblCellMar>
-        </w:tblPrEx>
         <w:trPr>
           <w:tblHeader/>
         </w:trPr>
@@ -7890,12 +7620,6 @@
         </w:tc>
       </w:tr>
       <w:tr>
-        <w:tblPrEx>
-          <w:tblCellMar>
-            <w:top w:w="0" w:type="dxa"/>
-            <w:bottom w:w="0" w:type="dxa"/>
-          </w:tblCellMar>
-        </w:tblPrEx>
         <w:tc>
           <w:tcPr>
             <w:tcW w:w="2600" w:type="dxa"/>
@@ -8038,12 +7762,6 @@
         </w:tc>
       </w:tr>
       <w:tr>
-        <w:tblPrEx>
-          <w:tblCellMar>
-            <w:top w:w="0" w:type="dxa"/>
-            <w:bottom w:w="0" w:type="dxa"/>
-          </w:tblCellMar>
-        </w:tblPrEx>
         <w:tc>
           <w:tcPr>
             <w:tcW w:w="2600" w:type="dxa"/>
@@ -8186,12 +7904,6 @@
         </w:tc>
       </w:tr>
       <w:tr>
-        <w:tblPrEx>
-          <w:tblCellMar>
-            <w:top w:w="0" w:type="dxa"/>
-            <w:bottom w:w="0" w:type="dxa"/>
-          </w:tblCellMar>
-        </w:tblPrEx>
         <w:tc>
           <w:tcPr>
             <w:tcW w:w="2600" w:type="dxa"/>
@@ -8334,12 +8046,6 @@
         </w:tc>
       </w:tr>
       <w:tr>
-        <w:tblPrEx>
-          <w:tblCellMar>
-            <w:top w:w="0" w:type="dxa"/>
-            <w:bottom w:w="0" w:type="dxa"/>
-          </w:tblCellMar>
-        </w:tblPrEx>
         <w:tc>
           <w:tcPr>
             <w:tcW w:w="2600" w:type="dxa"/>
@@ -8482,12 +8188,6 @@
         </w:tc>
       </w:tr>
       <w:tr>
-        <w:tblPrEx>
-          <w:tblCellMar>
-            <w:top w:w="0" w:type="dxa"/>
-            <w:bottom w:w="0" w:type="dxa"/>
-          </w:tblCellMar>
-        </w:tblPrEx>
         <w:tc>
           <w:tcPr>
             <w:tcW w:w="2600" w:type="dxa"/>
@@ -8630,12 +8330,6 @@
         </w:tc>
       </w:tr>
       <w:tr>
-        <w:tblPrEx>
-          <w:tblCellMar>
-            <w:top w:w="0" w:type="dxa"/>
-            <w:bottom w:w="0" w:type="dxa"/>
-          </w:tblCellMar>
-        </w:tblPrEx>
         <w:tc>
           <w:tcPr>
             <w:tcW w:w="2600" w:type="dxa"/>

</xml_diff>